<commit_message>
Ne révéler le sélecteur de semaine de départ qu'au clic sur Appliquer
Retour client du 22/09 : le sélecteur « Démarrer à la semaine » prenait
trop de place affiché d'emblée dès qu'un roulement porte sur ≥ 2 semaines.

Le raccourci redevient un bouton compact « Appliquer le roulement » par
défaut (comme avant l'ajout du sélecteur) ; pour un roulement
multi-semaines, un premier clic dessus révèle le sélecteur au lieu
d'appliquer directement, et un second clic sur « Appliquer » confirme.
Même principe dans le panneau de confirmation cliquer-glisser.

Co-Authored-By: Claude Sonnet 5 <noreply@anthropic.com>
Claude-Session: https://claude.ai/code/session_01H2QRgA4mSh1V53Zx5HzXZS
</commit_message>
<xml_diff>
--- a/SYNTHESE_FONCTIONNELLE.docx
+++ b/SYNTHESE_FONCTIONNELLE.docx
@@ -818,26 +818,26 @@
           <w:sz w:val="22"/>
           <w:szCs w:val="22"/>
         </w:rPr>
-        <w:t xml:space="preserve">Si le roulement porte sur plusieurs semaines, un sélecteur permet de choisir la semaine du motif à partir de laquelle démarrer (ex. un roulement sur 4 semaines : démarrer à la semaine 3 n'applique que les semaines 3 et 4 du motif, sur les 2 semaines calendaires suivant la case cliquée) — utile pour reprendre un roulement en cours de cycle, sans repartir systématiquement de sa première semaine (retour client du 22/09).</w:t>
-      </w:r>
-    </w:p>
-    <w:p>
-      <w:pPr>
-        <w:pStyle w:val="ListParagraph"/>
-        <w:numPr>
-          <w:ilvl w:val="0"/>
-          <w:numId w:val="2"/>
-        </w:numPr>
-        <w:spacing w:after="100" w:line="290"/>
-        <w:jc w:val="both"/>
-      </w:pPr>
-      <w:r>
-        <w:rPr>
-          <w:color w:val="334155"/>
-          <w:sz w:val="22"/>
-          <w:szCs w:val="22"/>
-        </w:rPr>
-        <w:t xml:space="preserve">Il est également possible de sélectionner plusieurs salariés à la fois (sur un même jour) pour appliquer en une seule action le roulement en cours de chacun, avec le même sélecteur de semaine de départ (borné par le roulement le plus long parmi les salariés sélectionnés) ; un récapitulatif indique qui sera planifié, qui est déjà planifié (donc ignoré), qui n'a pas de roulement assigné, et qui a un roulement plus court que la semaine de départ choisie (donc également ignoré).</w:t>
+        <w:t xml:space="preserve">Si le roulement porte sur plusieurs semaines, un second clic sur le raccourci (plutôt qu'une application immédiate) révèle un sélecteur pour choisir la semaine du motif à partir de laquelle démarrer (ex. un roulement sur 4 semaines : démarrer à la semaine 3 n'applique que les semaines 3 et 4 du motif, sur les 2 semaines calendaires suivant la case cliquée) — utile pour reprendre un roulement en cours de cycle, sans repartir systématiquement de sa première semaine. Ce sélecteur ne prend de la place à l'écran qu'après ce second clic, plutôt que d'être affiché d'emblée (retours client du 22/09).</w:t>
+      </w:r>
+    </w:p>
+    <w:p>
+      <w:pPr>
+        <w:pStyle w:val="ListParagraph"/>
+        <w:numPr>
+          <w:ilvl w:val="0"/>
+          <w:numId w:val="2"/>
+        </w:numPr>
+        <w:spacing w:after="100" w:line="290"/>
+        <w:jc w:val="both"/>
+      </w:pPr>
+      <w:r>
+        <w:rPr>
+          <w:color w:val="334155"/>
+          <w:sz w:val="22"/>
+          <w:szCs w:val="22"/>
+        </w:rPr>
+        <w:t xml:space="preserve">Il est également possible de sélectionner plusieurs salariés à la fois (sur un même jour) pour appliquer en une seule action le roulement en cours de chacun, avec le même principe de sélecteur de semaine de départ révélé au second clic (borné par le roulement le plus long parmi les salariés sélectionnés) ; un récapitulatif indique qui sera planifié, qui est déjà planifié (donc ignoré), qui n'a pas de roulement assigné, et qui a un roulement plus court que la semaine de départ choisie (donc également ignoré).</w:t>
       </w:r>
     </w:p>
     <w:p>

</xml_diff>